<commit_message>
Correct Digital Productivity outlines to 7 training hours
A 1-day programme (9:00 AM - 5:00 PM) counts as 7 training hours, not 6.5.

- HTML: headline chip, At-a-Glance and agenda meta now show 7 hours;
  session hours rebalanced to 0.5 + 1.5 + 0.75 + 0.75 + 1.5 + 1.5 + 0.5
  = 7.0 (Day 1 Total Hours 7.0); added matching exercise lines to the
  extended AI-awareness and dashboard sessions
- DOCX: timetable blocks now reconcile to exactly 7.0 hours with lunch
  excluded (morning/afternoon refreshment breaks taken within the 8A and
  8E blocks); Duration section states "1-day (7 training hours)"

Co-authored-by: Copilot <223556219+Copilot@users.noreply.github.com>
</commit_message>
<xml_diff>
--- a/training/01-general/ai_productivity_healthcare/M8 - DIGITAL PRODUCTIVITY & DATA AWARENESS (1 DAY).docx
+++ b/training/01-general/ai_productivity_healthcare/M8 - DIGITAL PRODUCTIVITY & DATA AWARENESS (1 DAY).docx
@@ -471,7 +471,7 @@
           <w:b/>
           <w:sz w:val="24"/>
         </w:rPr>
-        <w:t>9.30 AM – 10.45 AM: Module 8A – AI Awareness &amp; Effective Prompting for Workplace Productivity</w:t>
+        <w:t>9.30 AM – 11.00 AM: Module 8A – AI Awareness &amp; Effective Prompting for Workplace Productivity (includes short morning break)</w:t>
       </w:r>
     </w:p>
     <w:p>
@@ -547,20 +547,6 @@
           <w:sz w:val="24"/>
         </w:rPr>
         <w:t>•  Exercise: Prompt improvement practice</w:t>
-      </w:r>
-    </w:p>
-    <w:p>
-      <w:pPr>
-        <w:keepNext/>
-        <w:spacing w:before="160" w:after="40" w:line="240" w:lineRule="auto"/>
-      </w:pPr>
-      <w:r>
-        <w:rPr>
-          <w:rFonts w:ascii="Times New Roman" w:hAnsi="Times New Roman"/>
-          <w:b/>
-          <w:sz w:val="24"/>
-        </w:rPr>
-        <w:t>10.45 AM – 11.00 AM: Morning Break</w:t>
       </w:r>
     </w:p>
     <w:p>
@@ -810,21 +796,7 @@
           <w:b/>
           <w:sz w:val="24"/>
         </w:rPr>
-        <w:t>3.00 PM – 3.15 PM: Afternoon Break</w:t>
-      </w:r>
-    </w:p>
-    <w:p>
-      <w:pPr>
-        <w:keepNext/>
-        <w:spacing w:before="160" w:after="40" w:line="240" w:lineRule="auto"/>
-      </w:pPr>
-      <w:r>
-        <w:rPr>
-          <w:rFonts w:ascii="Times New Roman" w:hAnsi="Times New Roman"/>
-          <w:b/>
-          <w:sz w:val="24"/>
-        </w:rPr>
-        <w:t>3.15 PM – 4.30 PM: Module 8E – Dashboard Interpretation</w:t>
+        <w:t>3.00 PM – 4.30 PM: Module 8E – Dashboard Interpretation (includes short afternoon break)</w:t>
       </w:r>
     </w:p>
     <w:p>
@@ -1512,7 +1484,7 @@
           <w:b w:val="0"/>
           <w:sz w:val="24"/>
         </w:rPr>
-        <w:t>1-day</w:t>
+        <w:t>1-day (7 training hours)</w:t>
       </w:r>
     </w:p>
     <w:p>

</xml_diff>

<commit_message>
Reformat M8 DOCX to the M2 template style; split out breaks
Match the client M2 document's style and format:
- US Letter page, margins 1.25" left / 0.88" right, matching M2
- 20 pt bold centred module title, 18 pt white-on-teal section bars
  (#00708C), 12 pt Times New Roman body, 1.5 line spacing, justified
  paragraphs, hanging-indent bullets at the same offsets as M2
- Morning break, lunch hour and afternoon break are now listed as
  separate timetable lines (M2 pattern); session blocks run
  9.00-9.30, 9.30-10.45, 11.00-11.45, 11.45-12.30, 1.30-3.00,
  3.15-4.30 and 4.30-5.00
- Duration notes "1-day (7 training hours, excluding lunch break)"

Co-authored-by: Copilot <223556219+Copilot@users.noreply.github.com>
</commit_message>
<xml_diff>
--- a/training/01-general/ai_productivity_healthcare/M8 - DIGITAL PRODUCTIVITY & DATA AWARENESS (1 DAY).docx
+++ b/training/01-general/ai_productivity_healthcare/M8 - DIGITAL PRODUCTIVITY & DATA AWARENESS (1 DAY).docx
@@ -4,7 +4,7 @@
   <w:body>
     <w:p>
       <w:pPr>
-        <w:keepNext/>
+        <w:keepNext w:val="0"/>
         <w:spacing w:before="0" w:after="40" w:line="240" w:lineRule="auto"/>
         <w:jc w:val="center"/>
       </w:pPr>
@@ -12,22 +12,22 @@
         <w:rPr>
           <w:rFonts w:ascii="Times New Roman" w:hAnsi="Times New Roman"/>
           <w:b/>
-          <w:sz w:val="32"/>
+          <w:sz w:val="40"/>
         </w:rPr>
         <w:t>MODULE 8</w:t>
       </w:r>
     </w:p>
     <w:p>
       <w:pPr>
-        <w:keepNext/>
-        <w:spacing w:before="0" w:after="200" w:line="240" w:lineRule="auto"/>
+        <w:keepNext w:val="0"/>
+        <w:spacing w:before="0" w:after="240" w:line="240" w:lineRule="auto"/>
         <w:jc w:val="center"/>
       </w:pPr>
       <w:r>
         <w:rPr>
           <w:rFonts w:ascii="Times New Roman" w:hAnsi="Times New Roman"/>
           <w:b/>
-          <w:sz w:val="32"/>
+          <w:sz w:val="40"/>
         </w:rPr>
         <w:t>Title: DIGITAL PRODUCTIVITY &amp; DATA AWARENESS – WORKING SMARTER WITH MICROSOFT 365, MICROSOFT COPILOT &amp; GEMINI NOTEBOOK</w:t>
       </w:r>
@@ -35,7 +35,7 @@
     <w:p>
       <w:pPr>
         <w:keepNext/>
-        <w:spacing w:before="120" w:after="120" w:line="240" w:lineRule="auto"/>
+        <w:spacing w:before="200" w:after="240" w:line="240" w:lineRule="auto"/>
         <w:jc w:val="center"/>
         <w:shd w:val="clear" w:color="auto" w:fill="00708C"/>
       </w:pPr>
@@ -44,15 +44,15 @@
           <w:rFonts w:ascii="Times New Roman" w:hAnsi="Times New Roman"/>
           <w:b/>
           <w:color w:val="FFFFFF"/>
-          <w:sz w:val="28"/>
+          <w:sz w:val="36"/>
         </w:rPr>
         <w:t>Introduction</w:t>
       </w:r>
     </w:p>
     <w:p>
       <w:pPr>
-        <w:keepNext/>
-        <w:spacing w:before="0" w:after="160" w:line="240" w:lineRule="auto"/>
+        <w:keepNext w:val="0"/>
+        <w:spacing w:before="0" w:after="140" w:line="360" w:lineRule="auto"/>
         <w:jc w:val="both"/>
       </w:pPr>
       <w:r>
@@ -66,8 +66,8 @@
     </w:p>
     <w:p>
       <w:pPr>
-        <w:keepNext/>
-        <w:spacing w:before="0" w:after="160" w:line="240" w:lineRule="auto"/>
+        <w:keepNext w:val="0"/>
+        <w:spacing w:before="0" w:after="140" w:line="360" w:lineRule="auto"/>
         <w:jc w:val="both"/>
       </w:pPr>
       <w:r>
@@ -81,8 +81,8 @@
     </w:p>
     <w:p>
       <w:pPr>
-        <w:keepNext/>
-        <w:spacing w:before="0" w:after="160" w:line="240" w:lineRule="auto"/>
+        <w:keepNext w:val="0"/>
+        <w:spacing w:before="0" w:after="140" w:line="360" w:lineRule="auto"/>
         <w:jc w:val="both"/>
       </w:pPr>
       <w:r>
@@ -97,7 +97,7 @@
     <w:p>
       <w:pPr>
         <w:keepNext/>
-        <w:spacing w:before="120" w:after="120" w:line="240" w:lineRule="auto"/>
+        <w:spacing w:before="200" w:after="240" w:line="240" w:lineRule="auto"/>
         <w:jc w:val="center"/>
         <w:shd w:val="clear" w:color="auto" w:fill="00708C"/>
       </w:pPr>
@@ -106,15 +106,15 @@
           <w:rFonts w:ascii="Times New Roman" w:hAnsi="Times New Roman"/>
           <w:b/>
           <w:color w:val="FFFFFF"/>
-          <w:sz w:val="28"/>
+          <w:sz w:val="36"/>
         </w:rPr>
         <w:t>Training Objectives</w:t>
       </w:r>
     </w:p>
     <w:p>
       <w:pPr>
-        <w:keepNext/>
-        <w:spacing w:before="0" w:after="120" w:line="240" w:lineRule="auto"/>
+        <w:keepNext w:val="0"/>
+        <w:spacing w:before="0" w:after="140" w:line="360" w:lineRule="auto"/>
         <w:jc w:val="both"/>
       </w:pPr>
       <w:r>
@@ -128,9 +128,12 @@
     </w:p>
     <w:p>
       <w:pPr>
-        <w:keepNext/>
-        <w:spacing w:before="0" w:after="20" w:line="240" w:lineRule="auto"/>
-        <w:ind w:left="510"/>
+        <w:keepNext w:val="0"/>
+        <w:tabs>
+          <w:tab w:pos="737" w:val="left"/>
+        </w:tabs>
+        <w:spacing w:before="0" w:after="40" w:line="360" w:lineRule="auto"/>
+        <w:ind w:left="737" w:hanging="351"/>
       </w:pPr>
       <w:r>
         <w:rPr>
@@ -138,14 +141,19 @@
           <w:b w:val="0"/>
           <w:sz w:val="24"/>
         </w:rPr>
-        <w:t>•  Understand the fundamentals of generative AI and its practical workplace applications</w:t>
+        <w:t>•</w:t>
+        <w:tab/>
+        <w:t>Understand the fundamentals of generative AI and its practical workplace applications</w:t>
       </w:r>
     </w:p>
     <w:p>
       <w:pPr>
-        <w:keepNext/>
-        <w:spacing w:before="0" w:after="20" w:line="240" w:lineRule="auto"/>
-        <w:ind w:left="510"/>
+        <w:keepNext w:val="0"/>
+        <w:tabs>
+          <w:tab w:pos="737" w:val="left"/>
+        </w:tabs>
+        <w:spacing w:before="0" w:after="40" w:line="360" w:lineRule="auto"/>
+        <w:ind w:left="737" w:hanging="351"/>
       </w:pPr>
       <w:r>
         <w:rPr>
@@ -153,14 +161,19 @@
           <w:b w:val="0"/>
           <w:sz w:val="24"/>
         </w:rPr>
-        <w:t>•  Apply Microsoft Copilot across everyday Microsoft 365 tasks</w:t>
+        <w:t>•</w:t>
+        <w:tab/>
+        <w:t>Apply Microsoft Copilot across everyday Microsoft 365 tasks</w:t>
       </w:r>
     </w:p>
     <w:p>
       <w:pPr>
-        <w:keepNext/>
-        <w:spacing w:before="0" w:after="20" w:line="240" w:lineRule="auto"/>
-        <w:ind w:left="510"/>
+        <w:keepNext w:val="0"/>
+        <w:tabs>
+          <w:tab w:pos="737" w:val="left"/>
+        </w:tabs>
+        <w:spacing w:before="0" w:after="40" w:line="360" w:lineRule="auto"/>
+        <w:ind w:left="737" w:hanging="351"/>
       </w:pPr>
       <w:r>
         <w:rPr>
@@ -168,14 +181,19 @@
           <w:b w:val="0"/>
           <w:sz w:val="24"/>
         </w:rPr>
-        <w:t>•  Write effective prompts that produce useful and reliable outputs</w:t>
+        <w:t>•</w:t>
+        <w:tab/>
+        <w:t>Write effective prompts that produce useful and reliable outputs</w:t>
       </w:r>
     </w:p>
     <w:p>
       <w:pPr>
-        <w:keepNext/>
-        <w:spacing w:before="0" w:after="20" w:line="240" w:lineRule="auto"/>
-        <w:ind w:left="510"/>
+        <w:keepNext w:val="0"/>
+        <w:tabs>
+          <w:tab w:pos="737" w:val="left"/>
+        </w:tabs>
+        <w:spacing w:before="0" w:after="40" w:line="360" w:lineRule="auto"/>
+        <w:ind w:left="737" w:hanging="351"/>
       </w:pPr>
       <w:r>
         <w:rPr>
@@ -183,14 +201,19 @@
           <w:b w:val="0"/>
           <w:sz w:val="24"/>
         </w:rPr>
-        <w:t>•  Use Gemini Notebook to summarise and synthesise workplace documents</w:t>
+        <w:t>•</w:t>
+        <w:tab/>
+        <w:t>Use Gemini Notebook to summarise and synthesise workplace documents</w:t>
       </w:r>
     </w:p>
     <w:p>
       <w:pPr>
-        <w:keepNext/>
-        <w:spacing w:before="0" w:after="20" w:line="240" w:lineRule="auto"/>
-        <w:ind w:left="510"/>
+        <w:keepNext w:val="0"/>
+        <w:tabs>
+          <w:tab w:pos="737" w:val="left"/>
+        </w:tabs>
+        <w:spacing w:before="0" w:after="40" w:line="360" w:lineRule="auto"/>
+        <w:ind w:left="737" w:hanging="351"/>
       </w:pPr>
       <w:r>
         <w:rPr>
@@ -198,14 +221,19 @@
           <w:b w:val="0"/>
           <w:sz w:val="24"/>
         </w:rPr>
-        <w:t>•  Understand the purpose and characteristics of effective KPIs</w:t>
+        <w:t>•</w:t>
+        <w:tab/>
+        <w:t>Understand the purpose and characteristics of effective KPIs</w:t>
       </w:r>
     </w:p>
     <w:p>
       <w:pPr>
-        <w:keepNext/>
-        <w:spacing w:before="0" w:after="20" w:line="240" w:lineRule="auto"/>
-        <w:ind w:left="510"/>
+        <w:keepNext w:val="0"/>
+        <w:tabs>
+          <w:tab w:pos="737" w:val="left"/>
+        </w:tabs>
+        <w:spacing w:before="0" w:after="40" w:line="360" w:lineRule="auto"/>
+        <w:ind w:left="737" w:hanging="351"/>
       </w:pPr>
       <w:r>
         <w:rPr>
@@ -213,14 +241,19 @@
           <w:b w:val="0"/>
           <w:sz w:val="24"/>
         </w:rPr>
-        <w:t>•  Define practical KPIs for their own work processes</w:t>
+        <w:t>•</w:t>
+        <w:tab/>
+        <w:t>Define practical KPIs for their own work processes</w:t>
       </w:r>
     </w:p>
     <w:p>
       <w:pPr>
-        <w:keepNext/>
-        <w:spacing w:before="0" w:after="20" w:line="240" w:lineRule="auto"/>
-        <w:ind w:left="510"/>
+        <w:keepNext w:val="0"/>
+        <w:tabs>
+          <w:tab w:pos="737" w:val="left"/>
+        </w:tabs>
+        <w:spacing w:before="0" w:after="40" w:line="360" w:lineRule="auto"/>
+        <w:ind w:left="737" w:hanging="351"/>
       </w:pPr>
       <w:r>
         <w:rPr>
@@ -228,14 +261,19 @@
           <w:b w:val="0"/>
           <w:sz w:val="24"/>
         </w:rPr>
-        <w:t>•  Interpret dashboards and translate data into actions</w:t>
+        <w:t>•</w:t>
+        <w:tab/>
+        <w:t>Interpret dashboards and translate data into actions</w:t>
       </w:r>
     </w:p>
     <w:p>
       <w:pPr>
-        <w:keepNext/>
-        <w:spacing w:before="0" w:after="20" w:line="240" w:lineRule="auto"/>
-        <w:ind w:left="510"/>
+        <w:keepNext w:val="0"/>
+        <w:tabs>
+          <w:tab w:pos="737" w:val="left"/>
+        </w:tabs>
+        <w:spacing w:before="0" w:after="40" w:line="360" w:lineRule="auto"/>
+        <w:ind w:left="737" w:hanging="351"/>
       </w:pPr>
       <w:r>
         <w:rPr>
@@ -243,13 +281,15 @@
           <w:b w:val="0"/>
           <w:sz w:val="24"/>
         </w:rPr>
-        <w:t>•  Apply responsible AI and data confidentiality practices</w:t>
+        <w:t>•</w:t>
+        <w:tab/>
+        <w:t>Apply responsible AI and data confidentiality practices</w:t>
       </w:r>
     </w:p>
     <w:p>
       <w:pPr>
         <w:keepNext/>
-        <w:spacing w:before="120" w:after="120" w:line="240" w:lineRule="auto"/>
+        <w:spacing w:before="200" w:after="240" w:line="240" w:lineRule="auto"/>
         <w:jc w:val="center"/>
         <w:shd w:val="clear" w:color="auto" w:fill="00708C"/>
       </w:pPr>
@@ -258,15 +298,15 @@
           <w:rFonts w:ascii="Times New Roman" w:hAnsi="Times New Roman"/>
           <w:b/>
           <w:color w:val="FFFFFF"/>
-          <w:sz w:val="28"/>
+          <w:sz w:val="36"/>
         </w:rPr>
         <w:t>Training Outcomes</w:t>
       </w:r>
     </w:p>
     <w:p>
       <w:pPr>
-        <w:keepNext/>
-        <w:spacing w:before="0" w:after="120" w:line="240" w:lineRule="auto"/>
+        <w:keepNext w:val="0"/>
+        <w:spacing w:before="0" w:after="140" w:line="360" w:lineRule="auto"/>
         <w:jc w:val="both"/>
       </w:pPr>
       <w:r>
@@ -280,9 +320,12 @@
     </w:p>
     <w:p>
       <w:pPr>
-        <w:keepNext/>
-        <w:spacing w:before="0" w:after="20" w:line="240" w:lineRule="auto"/>
-        <w:ind w:left="510"/>
+        <w:keepNext w:val="0"/>
+        <w:tabs>
+          <w:tab w:pos="737" w:val="left"/>
+        </w:tabs>
+        <w:spacing w:before="0" w:after="40" w:line="360" w:lineRule="auto"/>
+        <w:ind w:left="737" w:hanging="351"/>
       </w:pPr>
       <w:r>
         <w:rPr>
@@ -290,14 +333,19 @@
           <w:b w:val="0"/>
           <w:sz w:val="24"/>
         </w:rPr>
-        <w:t>•  Use Microsoft Copilot confidently for drafting, summarising, analysing and preparing work</w:t>
+        <w:t>•</w:t>
+        <w:tab/>
+        <w:t>Use Microsoft Copilot confidently for drafting, summarising, analysing and preparing work</w:t>
       </w:r>
     </w:p>
     <w:p>
       <w:pPr>
-        <w:keepNext/>
-        <w:spacing w:before="0" w:after="20" w:line="240" w:lineRule="auto"/>
-        <w:ind w:left="510"/>
+        <w:keepNext w:val="0"/>
+        <w:tabs>
+          <w:tab w:pos="737" w:val="left"/>
+        </w:tabs>
+        <w:spacing w:before="0" w:after="40" w:line="360" w:lineRule="auto"/>
+        <w:ind w:left="737" w:hanging="351"/>
       </w:pPr>
       <w:r>
         <w:rPr>
@@ -305,14 +353,19 @@
           <w:b w:val="0"/>
           <w:sz w:val="24"/>
         </w:rPr>
-        <w:t>•  Produce clear, structured prompts for common workplace tasks</w:t>
+        <w:t>•</w:t>
+        <w:tab/>
+        <w:t>Produce clear, structured prompts for common workplace tasks</w:t>
       </w:r>
     </w:p>
     <w:p>
       <w:pPr>
-        <w:keepNext/>
-        <w:spacing w:before="0" w:after="20" w:line="240" w:lineRule="auto"/>
-        <w:ind w:left="510"/>
+        <w:keepNext w:val="0"/>
+        <w:tabs>
+          <w:tab w:pos="737" w:val="left"/>
+        </w:tabs>
+        <w:spacing w:before="0" w:after="40" w:line="360" w:lineRule="auto"/>
+        <w:ind w:left="737" w:hanging="351"/>
       </w:pPr>
       <w:r>
         <w:rPr>
@@ -320,14 +373,19 @@
           <w:b w:val="0"/>
           <w:sz w:val="24"/>
         </w:rPr>
-        <w:t>•  Summarise, compare and synthesise documents with Gemini Notebook</w:t>
+        <w:t>•</w:t>
+        <w:tab/>
+        <w:t>Summarise, compare and synthesise documents with Gemini Notebook</w:t>
       </w:r>
     </w:p>
     <w:p>
       <w:pPr>
-        <w:keepNext/>
-        <w:spacing w:before="0" w:after="20" w:line="240" w:lineRule="auto"/>
-        <w:ind w:left="510"/>
+        <w:keepNext w:val="0"/>
+        <w:tabs>
+          <w:tab w:pos="737" w:val="left"/>
+        </w:tabs>
+        <w:spacing w:before="0" w:after="40" w:line="360" w:lineRule="auto"/>
+        <w:ind w:left="737" w:hanging="351"/>
       </w:pPr>
       <w:r>
         <w:rPr>
@@ -335,14 +393,19 @@
           <w:b w:val="0"/>
           <w:sz w:val="24"/>
         </w:rPr>
-        <w:t>•  Explain KPI fundamentals and distinguish leading and lagging indicators</w:t>
+        <w:t>•</w:t>
+        <w:tab/>
+        <w:t>Explain KPI fundamentals and distinguish leading and lagging indicators</w:t>
       </w:r>
     </w:p>
     <w:p>
       <w:pPr>
-        <w:keepNext/>
-        <w:spacing w:before="0" w:after="20" w:line="240" w:lineRule="auto"/>
-        <w:ind w:left="510"/>
+        <w:keepNext w:val="0"/>
+        <w:tabs>
+          <w:tab w:pos="737" w:val="left"/>
+        </w:tabs>
+        <w:spacing w:before="0" w:after="40" w:line="360" w:lineRule="auto"/>
+        <w:ind w:left="737" w:hanging="351"/>
       </w:pPr>
       <w:r>
         <w:rPr>
@@ -350,14 +413,19 @@
           <w:b w:val="0"/>
           <w:sz w:val="24"/>
         </w:rPr>
-        <w:t>•  Select KPIs with targets, data sources and a realistic monitoring rhythm</w:t>
+        <w:t>•</w:t>
+        <w:tab/>
+        <w:t>Select KPIs with targets, data sources and a realistic monitoring rhythm</w:t>
       </w:r>
     </w:p>
     <w:p>
       <w:pPr>
-        <w:keepNext/>
-        <w:spacing w:before="0" w:after="20" w:line="240" w:lineRule="auto"/>
-        <w:ind w:left="510"/>
+        <w:keepNext w:val="0"/>
+        <w:tabs>
+          <w:tab w:pos="737" w:val="left"/>
+        </w:tabs>
+        <w:spacing w:before="0" w:after="40" w:line="360" w:lineRule="auto"/>
+        <w:ind w:left="737" w:hanging="351"/>
       </w:pPr>
       <w:r>
         <w:rPr>
@@ -365,14 +433,19 @@
           <w:b w:val="0"/>
           <w:sz w:val="24"/>
         </w:rPr>
-        <w:t>•  Read dashboards accurately and identify trends, exceptions and action points</w:t>
+        <w:t>•</w:t>
+        <w:tab/>
+        <w:t>Read dashboards accurately and identify trends, exceptions and action points</w:t>
       </w:r>
     </w:p>
     <w:p>
       <w:pPr>
-        <w:keepNext/>
-        <w:spacing w:before="0" w:after="20" w:line="240" w:lineRule="auto"/>
-        <w:ind w:left="510"/>
+        <w:keepNext w:val="0"/>
+        <w:tabs>
+          <w:tab w:pos="737" w:val="left"/>
+        </w:tabs>
+        <w:spacing w:before="0" w:after="40" w:line="360" w:lineRule="auto"/>
+        <w:ind w:left="737" w:hanging="351"/>
       </w:pPr>
       <w:r>
         <w:rPr>
@@ -380,14 +453,19 @@
           <w:b w:val="0"/>
           <w:sz w:val="24"/>
         </w:rPr>
-        <w:t>•  Present data-driven findings and recommendations with confidence</w:t>
+        <w:t>•</w:t>
+        <w:tab/>
+        <w:t>Present data-driven findings and recommendations with confidence</w:t>
       </w:r>
     </w:p>
     <w:p>
       <w:pPr>
-        <w:keepNext/>
-        <w:spacing w:before="0" w:after="20" w:line="240" w:lineRule="auto"/>
-        <w:ind w:left="510"/>
+        <w:keepNext w:val="0"/>
+        <w:tabs>
+          <w:tab w:pos="737" w:val="left"/>
+        </w:tabs>
+        <w:spacing w:before="0" w:after="40" w:line="360" w:lineRule="auto"/>
+        <w:ind w:left="737" w:hanging="351"/>
       </w:pPr>
       <w:r>
         <w:rPr>
@@ -395,14 +473,15 @@
           <w:b w:val="0"/>
           <w:sz w:val="24"/>
         </w:rPr>
-        <w:t>•  Apply responsible AI and confidentiality practices in daily work</w:t>
+        <w:t>•</w:t>
+        <w:tab/>
+        <w:t>Apply responsible AI and confidentiality practices in daily work</w:t>
       </w:r>
     </w:p>
     <w:p>
       <w:pPr>
         <w:keepNext/>
-        <w:pageBreakBefore/>
-        <w:spacing w:before="120" w:after="120" w:line="240" w:lineRule="auto"/>
+        <w:spacing w:before="200" w:after="240" w:line="240" w:lineRule="auto"/>
         <w:jc w:val="center"/>
         <w:shd w:val="clear" w:color="auto" w:fill="00708C"/>
       </w:pPr>
@@ -411,7 +490,7 @@
           <w:rFonts w:ascii="Times New Roman" w:hAnsi="Times New Roman"/>
           <w:b/>
           <w:color w:val="FFFFFF"/>
-          <w:sz w:val="28"/>
+          <w:sz w:val="36"/>
         </w:rPr>
         <w:t>Course Content</w:t>
       </w:r>
@@ -419,7 +498,7 @@
     <w:p>
       <w:pPr>
         <w:keepNext/>
-        <w:spacing w:before="160" w:after="40" w:line="240" w:lineRule="auto"/>
+        <w:spacing w:before="200" w:after="40" w:line="240" w:lineRule="auto"/>
       </w:pPr>
       <w:r>
         <w:rPr>
@@ -432,9 +511,12 @@
     </w:p>
     <w:p>
       <w:pPr>
-        <w:keepNext/>
-        <w:spacing w:before="0" w:after="20" w:line="240" w:lineRule="auto"/>
-        <w:ind w:left="510"/>
+        <w:keepNext w:val="0"/>
+        <w:tabs>
+          <w:tab w:pos="737" w:val="left"/>
+        </w:tabs>
+        <w:spacing w:before="0" w:after="40" w:line="360" w:lineRule="auto"/>
+        <w:ind w:left="737" w:hanging="351"/>
       </w:pPr>
       <w:r>
         <w:rPr>
@@ -442,14 +524,19 @@
           <w:b w:val="0"/>
           <w:sz w:val="24"/>
         </w:rPr>
-        <w:t>•  Welcome, programme objectives and expectations</w:t>
+        <w:t>•</w:t>
+        <w:tab/>
+        <w:t>Welcome, programme objectives and expectations</w:t>
       </w:r>
     </w:p>
     <w:p>
       <w:pPr>
-        <w:keepNext/>
-        <w:spacing w:before="0" w:after="20" w:line="240" w:lineRule="auto"/>
-        <w:ind w:left="510"/>
+        <w:keepNext w:val="0"/>
+        <w:tabs>
+          <w:tab w:pos="737" w:val="left"/>
+        </w:tabs>
+        <w:spacing w:before="0" w:after="40" w:line="360" w:lineRule="auto"/>
+        <w:ind w:left="737" w:hanging="351"/>
       </w:pPr>
       <w:r>
         <w:rPr>
@@ -457,13 +544,15 @@
           <w:b w:val="0"/>
           <w:sz w:val="24"/>
         </w:rPr>
-        <w:t>•  Ice-breaker: “Where Does My Work Time Go?”</w:t>
+        <w:t>•</w:t>
+        <w:tab/>
+        <w:t>Ice-breaker: “Where Does My Work Time Go?”</w:t>
       </w:r>
     </w:p>
     <w:p>
       <w:pPr>
         <w:keepNext/>
-        <w:spacing w:before="160" w:after="40" w:line="240" w:lineRule="auto"/>
+        <w:spacing w:before="200" w:after="40" w:line="240" w:lineRule="auto"/>
       </w:pPr>
       <w:r>
         <w:rPr>
@@ -471,14 +560,17 @@
           <w:b/>
           <w:sz w:val="24"/>
         </w:rPr>
-        <w:t>9.30 AM – 11.00 AM: Module 8A – AI Awareness &amp; Effective Prompting for Workplace Productivity (includes short morning break)</w:t>
+        <w:t>9.30 AM – 10.45 AM: Module 8A – AI Awareness &amp; Effective Prompting for Workplace Productivity</w:t>
       </w:r>
     </w:p>
     <w:p>
       <w:pPr>
-        <w:keepNext/>
-        <w:spacing w:before="0" w:after="20" w:line="240" w:lineRule="auto"/>
-        <w:ind w:left="510"/>
+        <w:keepNext w:val="0"/>
+        <w:tabs>
+          <w:tab w:pos="737" w:val="left"/>
+        </w:tabs>
+        <w:spacing w:before="0" w:after="40" w:line="360" w:lineRule="auto"/>
+        <w:ind w:left="737" w:hanging="351"/>
       </w:pPr>
       <w:r>
         <w:rPr>
@@ -486,14 +578,19 @@
           <w:b w:val="0"/>
           <w:sz w:val="24"/>
         </w:rPr>
-        <w:t>•  Generative AI concepts — capabilities and limitations</w:t>
+        <w:t>•</w:t>
+        <w:tab/>
+        <w:t>Generative AI concepts — capabilities and limitations</w:t>
       </w:r>
     </w:p>
     <w:p>
       <w:pPr>
-        <w:keepNext/>
-        <w:spacing w:before="0" w:after="20" w:line="240" w:lineRule="auto"/>
-        <w:ind w:left="510"/>
+        <w:keepNext w:val="0"/>
+        <w:tabs>
+          <w:tab w:pos="737" w:val="left"/>
+        </w:tabs>
+        <w:spacing w:before="0" w:after="40" w:line="360" w:lineRule="auto"/>
+        <w:ind w:left="737" w:hanging="351"/>
       </w:pPr>
       <w:r>
         <w:rPr>
@@ -501,14 +598,19 @@
           <w:b w:val="0"/>
           <w:sz w:val="24"/>
         </w:rPr>
-        <w:t>•  Responsible use, confidentiality and verification of AI output</w:t>
+        <w:t>•</w:t>
+        <w:tab/>
+        <w:t>Responsible use, confidentiality and verification of AI output</w:t>
       </w:r>
     </w:p>
     <w:p>
       <w:pPr>
-        <w:keepNext/>
-        <w:spacing w:before="0" w:after="20" w:line="240" w:lineRule="auto"/>
-        <w:ind w:left="510"/>
+        <w:keepNext w:val="0"/>
+        <w:tabs>
+          <w:tab w:pos="737" w:val="left"/>
+        </w:tabs>
+        <w:spacing w:before="0" w:after="40" w:line="360" w:lineRule="auto"/>
+        <w:ind w:left="737" w:hanging="351"/>
       </w:pPr>
       <w:r>
         <w:rPr>
@@ -516,14 +618,19 @@
           <w:b w:val="0"/>
           <w:sz w:val="24"/>
         </w:rPr>
-        <w:t>•  Introduction to Microsoft Copilot and Gemini Notebook</w:t>
+        <w:t>•</w:t>
+        <w:tab/>
+        <w:t>Introduction to Microsoft Copilot and Gemini Notebook</w:t>
       </w:r>
     </w:p>
     <w:p>
       <w:pPr>
-        <w:keepNext/>
-        <w:spacing w:before="0" w:after="20" w:line="240" w:lineRule="auto"/>
-        <w:ind w:left="510"/>
+        <w:keepNext w:val="0"/>
+        <w:tabs>
+          <w:tab w:pos="737" w:val="left"/>
+        </w:tabs>
+        <w:spacing w:before="0" w:after="40" w:line="360" w:lineRule="auto"/>
+        <w:ind w:left="737" w:hanging="351"/>
       </w:pPr>
       <w:r>
         <w:rPr>
@@ -531,14 +638,19 @@
           <w:b w:val="0"/>
           <w:sz w:val="24"/>
         </w:rPr>
-        <w:t>•  Anatomy of an effective prompt — context, instructions, constraints and output format</w:t>
+        <w:t>•</w:t>
+        <w:tab/>
+        <w:t>Anatomy of an effective prompt — context, instructions, constraints and output format</w:t>
       </w:r>
     </w:p>
     <w:p>
       <w:pPr>
-        <w:keepNext/>
-        <w:spacing w:before="0" w:after="20" w:line="240" w:lineRule="auto"/>
-        <w:ind w:left="510"/>
+        <w:keepNext w:val="0"/>
+        <w:tabs>
+          <w:tab w:pos="737" w:val="left"/>
+        </w:tabs>
+        <w:spacing w:before="0" w:after="40" w:line="360" w:lineRule="auto"/>
+        <w:ind w:left="737" w:hanging="351"/>
       </w:pPr>
       <w:r>
         <w:rPr>
@@ -546,13 +658,29 @@
           <w:b w:val="0"/>
           <w:sz w:val="24"/>
         </w:rPr>
-        <w:t>•  Exercise: Prompt improvement practice</w:t>
+        <w:t>•</w:t>
+        <w:tab/>
+        <w:t>Exercise: Prompt improvement practice</w:t>
       </w:r>
     </w:p>
     <w:p>
       <w:pPr>
         <w:keepNext/>
-        <w:spacing w:before="160" w:after="40" w:line="240" w:lineRule="auto"/>
+        <w:spacing w:before="200" w:after="40" w:line="240" w:lineRule="auto"/>
+      </w:pPr>
+      <w:r>
+        <w:rPr>
+          <w:rFonts w:ascii="Times New Roman" w:hAnsi="Times New Roman"/>
+          <w:b/>
+          <w:sz w:val="24"/>
+        </w:rPr>
+        <w:t>10.45 AM – 11.00 AM: Morning Break</w:t>
+      </w:r>
+    </w:p>
+    <w:p>
+      <w:pPr>
+        <w:keepNext/>
+        <w:spacing w:before="200" w:after="40" w:line="240" w:lineRule="auto"/>
       </w:pPr>
       <w:r>
         <w:rPr>
@@ -565,9 +693,12 @@
     </w:p>
     <w:p>
       <w:pPr>
-        <w:keepNext/>
-        <w:spacing w:before="0" w:after="20" w:line="240" w:lineRule="auto"/>
-        <w:ind w:left="510"/>
+        <w:keepNext w:val="0"/>
+        <w:tabs>
+          <w:tab w:pos="737" w:val="left"/>
+        </w:tabs>
+        <w:spacing w:before="0" w:after="40" w:line="360" w:lineRule="auto"/>
+        <w:ind w:left="737" w:hanging="351"/>
       </w:pPr>
       <w:r>
         <w:rPr>
@@ -575,14 +706,19 @@
           <w:b w:val="0"/>
           <w:sz w:val="24"/>
         </w:rPr>
-        <w:t>•  Copilot across Word, Excel, Outlook, Teams and PowerPoint</w:t>
+        <w:t>•</w:t>
+        <w:tab/>
+        <w:t>Copilot across Word, Excel, Outlook, Teams and PowerPoint</w:t>
       </w:r>
     </w:p>
     <w:p>
       <w:pPr>
-        <w:keepNext/>
-        <w:spacing w:before="0" w:after="20" w:line="240" w:lineRule="auto"/>
-        <w:ind w:left="510"/>
+        <w:keepNext w:val="0"/>
+        <w:tabs>
+          <w:tab w:pos="737" w:val="left"/>
+        </w:tabs>
+        <w:spacing w:before="0" w:after="40" w:line="360" w:lineRule="auto"/>
+        <w:ind w:left="737" w:hanging="351"/>
       </w:pPr>
       <w:r>
         <w:rPr>
@@ -590,14 +726,19 @@
           <w:b w:val="0"/>
           <w:sz w:val="24"/>
         </w:rPr>
-        <w:t>•  Drafting documents and summarising email threads and meetings</w:t>
+        <w:t>•</w:t>
+        <w:tab/>
+        <w:t>Drafting documents and summarising email threads and meetings</w:t>
       </w:r>
     </w:p>
     <w:p>
       <w:pPr>
-        <w:keepNext/>
-        <w:spacing w:before="0" w:after="20" w:line="240" w:lineRule="auto"/>
-        <w:ind w:left="510"/>
+        <w:keepNext w:val="0"/>
+        <w:tabs>
+          <w:tab w:pos="737" w:val="left"/>
+        </w:tabs>
+        <w:spacing w:before="0" w:after="40" w:line="360" w:lineRule="auto"/>
+        <w:ind w:left="737" w:hanging="351"/>
       </w:pPr>
       <w:r>
         <w:rPr>
@@ -605,13 +746,15 @@
           <w:b w:val="0"/>
           <w:sz w:val="24"/>
         </w:rPr>
-        <w:t>•  Exercise: Complete an everyday workplace task with Copilot</w:t>
+        <w:t>•</w:t>
+        <w:tab/>
+        <w:t>Exercise: Complete an everyday workplace task with Copilot</w:t>
       </w:r>
     </w:p>
     <w:p>
       <w:pPr>
         <w:keepNext/>
-        <w:spacing w:before="160" w:after="40" w:line="240" w:lineRule="auto"/>
+        <w:spacing w:before="200" w:after="40" w:line="240" w:lineRule="auto"/>
       </w:pPr>
       <w:r>
         <w:rPr>
@@ -624,9 +767,12 @@
     </w:p>
     <w:p>
       <w:pPr>
-        <w:keepNext/>
-        <w:spacing w:before="0" w:after="20" w:line="240" w:lineRule="auto"/>
-        <w:ind w:left="510"/>
+        <w:keepNext w:val="0"/>
+        <w:tabs>
+          <w:tab w:pos="737" w:val="left"/>
+        </w:tabs>
+        <w:spacing w:before="0" w:after="40" w:line="360" w:lineRule="auto"/>
+        <w:ind w:left="737" w:hanging="351"/>
       </w:pPr>
       <w:r>
         <w:rPr>
@@ -634,14 +780,19 @@
           <w:b w:val="0"/>
           <w:sz w:val="24"/>
         </w:rPr>
-        <w:t>•  Source-grounded AI — working with your own documents</w:t>
+        <w:t>•</w:t>
+        <w:tab/>
+        <w:t>Source-grounded AI — working with your own documents</w:t>
       </w:r>
     </w:p>
     <w:p>
       <w:pPr>
-        <w:keepNext/>
-        <w:spacing w:before="0" w:after="20" w:line="240" w:lineRule="auto"/>
-        <w:ind w:left="510"/>
+        <w:keepNext w:val="0"/>
+        <w:tabs>
+          <w:tab w:pos="737" w:val="left"/>
+        </w:tabs>
+        <w:spacing w:before="0" w:after="40" w:line="360" w:lineRule="auto"/>
+        <w:ind w:left="737" w:hanging="351"/>
       </w:pPr>
       <w:r>
         <w:rPr>
@@ -649,14 +800,19 @@
           <w:b w:val="0"/>
           <w:sz w:val="24"/>
         </w:rPr>
-        <w:t>•  Summarising, comparing and synthesising information with citations</w:t>
+        <w:t>•</w:t>
+        <w:tab/>
+        <w:t>Summarising, comparing and synthesising information with citations</w:t>
       </w:r>
     </w:p>
     <w:p>
       <w:pPr>
-        <w:keepNext/>
-        <w:spacing w:before="0" w:after="20" w:line="240" w:lineRule="auto"/>
-        <w:ind w:left="510"/>
+        <w:keepNext w:val="0"/>
+        <w:tabs>
+          <w:tab w:pos="737" w:val="left"/>
+        </w:tabs>
+        <w:spacing w:before="0" w:after="40" w:line="360" w:lineRule="auto"/>
+        <w:ind w:left="737" w:hanging="351"/>
       </w:pPr>
       <w:r>
         <w:rPr>
@@ -664,13 +820,15 @@
           <w:b w:val="0"/>
           <w:sz w:val="24"/>
         </w:rPr>
-        <w:t>•  Exercise: Build a notebook and produce a briefing note</w:t>
+        <w:t>•</w:t>
+        <w:tab/>
+        <w:t>Exercise: Build a notebook and produce a briefing note</w:t>
       </w:r>
     </w:p>
     <w:p>
       <w:pPr>
         <w:keepNext/>
-        <w:spacing w:before="160" w:after="40" w:line="240" w:lineRule="auto"/>
+        <w:spacing w:before="200" w:after="40" w:line="240" w:lineRule="auto"/>
       </w:pPr>
       <w:r>
         <w:rPr>
@@ -684,7 +842,7 @@
     <w:p>
       <w:pPr>
         <w:keepNext/>
-        <w:spacing w:before="160" w:after="40" w:line="240" w:lineRule="auto"/>
+        <w:spacing w:before="200" w:after="40" w:line="240" w:lineRule="auto"/>
       </w:pPr>
       <w:r>
         <w:rPr>
@@ -697,9 +855,12 @@
     </w:p>
     <w:p>
       <w:pPr>
-        <w:keepNext/>
-        <w:spacing w:before="0" w:after="20" w:line="240" w:lineRule="auto"/>
-        <w:ind w:left="510"/>
+        <w:keepNext w:val="0"/>
+        <w:tabs>
+          <w:tab w:pos="737" w:val="left"/>
+        </w:tabs>
+        <w:spacing w:before="0" w:after="40" w:line="360" w:lineRule="auto"/>
+        <w:ind w:left="737" w:hanging="351"/>
       </w:pPr>
       <w:r>
         <w:rPr>
@@ -707,14 +868,19 @@
           <w:b w:val="0"/>
           <w:sz w:val="24"/>
         </w:rPr>
-        <w:t>•  What KPIs are — KPIs vs metrics and targets</w:t>
+        <w:t>•</w:t>
+        <w:tab/>
+        <w:t>What KPIs are — KPIs vs metrics and targets</w:t>
       </w:r>
     </w:p>
     <w:p>
       <w:pPr>
-        <w:keepNext/>
-        <w:spacing w:before="0" w:after="20" w:line="240" w:lineRule="auto"/>
-        <w:ind w:left="510"/>
+        <w:keepNext w:val="0"/>
+        <w:tabs>
+          <w:tab w:pos="737" w:val="left"/>
+        </w:tabs>
+        <w:spacing w:before="0" w:after="40" w:line="360" w:lineRule="auto"/>
+        <w:ind w:left="737" w:hanging="351"/>
       </w:pPr>
       <w:r>
         <w:rPr>
@@ -722,14 +888,19 @@
           <w:b w:val="0"/>
           <w:sz w:val="24"/>
         </w:rPr>
-        <w:t>•  Leading and lagging indicators</w:t>
+        <w:t>•</w:t>
+        <w:tab/>
+        <w:t>Leading and lagging indicators</w:t>
       </w:r>
     </w:p>
     <w:p>
       <w:pPr>
-        <w:keepNext/>
-        <w:spacing w:before="0" w:after="20" w:line="240" w:lineRule="auto"/>
-        <w:ind w:left="510"/>
+        <w:keepNext w:val="0"/>
+        <w:tabs>
+          <w:tab w:pos="737" w:val="left"/>
+        </w:tabs>
+        <w:spacing w:before="0" w:after="40" w:line="360" w:lineRule="auto"/>
+        <w:ind w:left="737" w:hanging="351"/>
       </w:pPr>
       <w:r>
         <w:rPr>
@@ -737,14 +908,19 @@
           <w:b w:val="0"/>
           <w:sz w:val="24"/>
         </w:rPr>
-        <w:t>•  Characteristics of effective KPIs</w:t>
+        <w:t>•</w:t>
+        <w:tab/>
+        <w:t>Characteristics of effective KPIs</w:t>
       </w:r>
     </w:p>
     <w:p>
       <w:pPr>
-        <w:keepNext/>
-        <w:spacing w:before="0" w:after="20" w:line="240" w:lineRule="auto"/>
-        <w:ind w:left="510"/>
+        <w:keepNext w:val="0"/>
+        <w:tabs>
+          <w:tab w:pos="737" w:val="left"/>
+        </w:tabs>
+        <w:spacing w:before="0" w:after="40" w:line="360" w:lineRule="auto"/>
+        <w:ind w:left="737" w:hanging="351"/>
       </w:pPr>
       <w:r>
         <w:rPr>
@@ -752,14 +928,19 @@
           <w:b w:val="0"/>
           <w:sz w:val="24"/>
         </w:rPr>
-        <w:t>•  Defining KPIs — data source, target and review frequency</w:t>
+        <w:t>•</w:t>
+        <w:tab/>
+        <w:t>Defining KPIs — data source, target and review frequency</w:t>
       </w:r>
     </w:p>
     <w:p>
       <w:pPr>
-        <w:keepNext/>
-        <w:spacing w:before="0" w:after="20" w:line="240" w:lineRule="auto"/>
-        <w:ind w:left="510"/>
+        <w:keepNext w:val="0"/>
+        <w:tabs>
+          <w:tab w:pos="737" w:val="left"/>
+        </w:tabs>
+        <w:spacing w:before="0" w:after="40" w:line="360" w:lineRule="auto"/>
+        <w:ind w:left="737" w:hanging="351"/>
       </w:pPr>
       <w:r>
         <w:rPr>
@@ -767,14 +948,19 @@
           <w:b w:val="0"/>
           <w:sz w:val="24"/>
         </w:rPr>
-        <w:t>•  Exercise: Define KPIs for a real work process</w:t>
+        <w:t>•</w:t>
+        <w:tab/>
+        <w:t>Exercise: Define KPIs for a real work process</w:t>
       </w:r>
     </w:p>
     <w:p>
       <w:pPr>
-        <w:keepNext/>
-        <w:spacing w:before="0" w:after="20" w:line="240" w:lineRule="auto"/>
-        <w:ind w:left="510"/>
+        <w:keepNext w:val="0"/>
+        <w:tabs>
+          <w:tab w:pos="737" w:val="left"/>
+        </w:tabs>
+        <w:spacing w:before="0" w:after="40" w:line="360" w:lineRule="auto"/>
+        <w:ind w:left="737" w:hanging="351"/>
       </w:pPr>
       <w:r>
         <w:rPr>
@@ -782,13 +968,15 @@
           <w:b w:val="0"/>
           <w:sz w:val="24"/>
         </w:rPr>
-        <w:t>•  Discussion: Common KPI pitfalls</w:t>
+        <w:t>•</w:t>
+        <w:tab/>
+        <w:t>Discussion: Common KPI pitfalls</w:t>
       </w:r>
     </w:p>
     <w:p>
       <w:pPr>
         <w:keepNext/>
-        <w:spacing w:before="160" w:after="40" w:line="240" w:lineRule="auto"/>
+        <w:spacing w:before="200" w:after="40" w:line="240" w:lineRule="auto"/>
       </w:pPr>
       <w:r>
         <w:rPr>
@@ -796,14 +984,31 @@
           <w:b/>
           <w:sz w:val="24"/>
         </w:rPr>
-        <w:t>3.00 PM – 4.30 PM: Module 8E – Dashboard Interpretation (includes short afternoon break)</w:t>
+        <w:t>3.00 PM – 3.15 PM: Afternoon Break</w:t>
       </w:r>
     </w:p>
     <w:p>
       <w:pPr>
         <w:keepNext/>
-        <w:spacing w:before="0" w:after="20" w:line="240" w:lineRule="auto"/>
-        <w:ind w:left="510"/>
+        <w:spacing w:before="200" w:after="40" w:line="240" w:lineRule="auto"/>
+      </w:pPr>
+      <w:r>
+        <w:rPr>
+          <w:rFonts w:ascii="Times New Roman" w:hAnsi="Times New Roman"/>
+          <w:b/>
+          <w:sz w:val="24"/>
+        </w:rPr>
+        <w:t>3.15 PM – 4.30 PM: Module 8E – Dashboard Interpretation</w:t>
+      </w:r>
+    </w:p>
+    <w:p>
+      <w:pPr>
+        <w:keepNext w:val="0"/>
+        <w:tabs>
+          <w:tab w:pos="737" w:val="left"/>
+        </w:tabs>
+        <w:spacing w:before="0" w:after="40" w:line="360" w:lineRule="auto"/>
+        <w:ind w:left="737" w:hanging="351"/>
       </w:pPr>
       <w:r>
         <w:rPr>
@@ -811,14 +1016,19 @@
           <w:b w:val="0"/>
           <w:sz w:val="24"/>
         </w:rPr>
-        <w:t>•  Dashboard anatomy — charts, gauges, filters and comparisons</w:t>
+        <w:t>•</w:t>
+        <w:tab/>
+        <w:t>Dashboard anatomy — charts, gauges, filters and comparisons</w:t>
       </w:r>
     </w:p>
     <w:p>
       <w:pPr>
-        <w:keepNext/>
-        <w:spacing w:before="0" w:after="20" w:line="240" w:lineRule="auto"/>
-        <w:ind w:left="510"/>
+        <w:keepNext w:val="0"/>
+        <w:tabs>
+          <w:tab w:pos="737" w:val="left"/>
+        </w:tabs>
+        <w:spacing w:before="0" w:after="40" w:line="360" w:lineRule="auto"/>
+        <w:ind w:left="737" w:hanging="351"/>
       </w:pPr>
       <w:r>
         <w:rPr>
@@ -826,14 +1036,19 @@
           <w:b w:val="0"/>
           <w:sz w:val="24"/>
         </w:rPr>
-        <w:t>•  Reading trends, comparisons and outliers</w:t>
+        <w:t>•</w:t>
+        <w:tab/>
+        <w:t>Reading trends, comparisons and outliers</w:t>
       </w:r>
     </w:p>
     <w:p>
       <w:pPr>
-        <w:keepNext/>
-        <w:spacing w:before="0" w:after="20" w:line="240" w:lineRule="auto"/>
-        <w:ind w:left="510"/>
+        <w:keepNext w:val="0"/>
+        <w:tabs>
+          <w:tab w:pos="737" w:val="left"/>
+        </w:tabs>
+        <w:spacing w:before="0" w:after="40" w:line="360" w:lineRule="auto"/>
+        <w:ind w:left="737" w:hanging="351"/>
       </w:pPr>
       <w:r>
         <w:rPr>
@@ -841,14 +1056,19 @@
           <w:b w:val="0"/>
           <w:sz w:val="24"/>
         </w:rPr>
-        <w:t>•  Spotting misleading visuals</w:t>
+        <w:t>•</w:t>
+        <w:tab/>
+        <w:t>Spotting misleading visuals</w:t>
       </w:r>
     </w:p>
     <w:p>
       <w:pPr>
-        <w:keepNext/>
-        <w:spacing w:before="0" w:after="20" w:line="240" w:lineRule="auto"/>
-        <w:ind w:left="510"/>
+        <w:keepNext w:val="0"/>
+        <w:tabs>
+          <w:tab w:pos="737" w:val="left"/>
+        </w:tabs>
+        <w:spacing w:before="0" w:after="40" w:line="360" w:lineRule="auto"/>
+        <w:ind w:left="737" w:hanging="351"/>
       </w:pPr>
       <w:r>
         <w:rPr>
@@ -856,13 +1076,15 @@
           <w:b w:val="0"/>
           <w:sz w:val="24"/>
         </w:rPr>
-        <w:t>•  Exercise: Interpret a sample dashboard and present a data-driven recommendation</w:t>
+        <w:t>•</w:t>
+        <w:tab/>
+        <w:t>Exercise: Interpret a sample dashboard and present a data-driven recommendation</w:t>
       </w:r>
     </w:p>
     <w:p>
       <w:pPr>
         <w:keepNext/>
-        <w:spacing w:before="160" w:after="40" w:line="240" w:lineRule="auto"/>
+        <w:spacing w:before="200" w:after="40" w:line="240" w:lineRule="auto"/>
       </w:pPr>
       <w:r>
         <w:rPr>
@@ -875,9 +1097,12 @@
     </w:p>
     <w:p>
       <w:pPr>
-        <w:keepNext/>
-        <w:spacing w:before="0" w:after="20" w:line="240" w:lineRule="auto"/>
-        <w:ind w:left="510"/>
+        <w:keepNext w:val="0"/>
+        <w:tabs>
+          <w:tab w:pos="737" w:val="left"/>
+        </w:tabs>
+        <w:spacing w:before="0" w:after="40" w:line="360" w:lineRule="auto"/>
+        <w:ind w:left="737" w:hanging="351"/>
       </w:pPr>
       <w:r>
         <w:rPr>
@@ -885,14 +1110,19 @@
           <w:b w:val="0"/>
           <w:sz w:val="24"/>
         </w:rPr>
-        <w:t>•  Productivity and data awareness competency check</w:t>
+        <w:t>•</w:t>
+        <w:tab/>
+        <w:t>Productivity and data awareness competency check</w:t>
       </w:r>
     </w:p>
     <w:p>
       <w:pPr>
-        <w:keepNext/>
-        <w:spacing w:before="0" w:after="20" w:line="240" w:lineRule="auto"/>
-        <w:ind w:left="510"/>
+        <w:keepNext w:val="0"/>
+        <w:tabs>
+          <w:tab w:pos="737" w:val="left"/>
+        </w:tabs>
+        <w:spacing w:before="0" w:after="40" w:line="360" w:lineRule="auto"/>
+        <w:ind w:left="737" w:hanging="351"/>
       </w:pPr>
       <w:r>
         <w:rPr>
@@ -900,14 +1130,19 @@
           <w:b w:val="0"/>
           <w:sz w:val="24"/>
         </w:rPr>
-        <w:t>•  Facilitator feedback</w:t>
+        <w:t>•</w:t>
+        <w:tab/>
+        <w:t>Facilitator feedback</w:t>
       </w:r>
     </w:p>
     <w:p>
       <w:pPr>
-        <w:keepNext/>
-        <w:spacing w:before="0" w:after="20" w:line="240" w:lineRule="auto"/>
-        <w:ind w:left="510"/>
+        <w:keepNext w:val="0"/>
+        <w:tabs>
+          <w:tab w:pos="737" w:val="left"/>
+        </w:tabs>
+        <w:spacing w:before="0" w:after="40" w:line="360" w:lineRule="auto"/>
+        <w:ind w:left="737" w:hanging="351"/>
       </w:pPr>
       <w:r>
         <w:rPr>
@@ -915,14 +1150,19 @@
           <w:b w:val="0"/>
           <w:sz w:val="24"/>
         </w:rPr>
-        <w:t>•  Workplace Improvement Project planning</w:t>
+        <w:t>•</w:t>
+        <w:tab/>
+        <w:t>Workplace Improvement Project planning</w:t>
       </w:r>
     </w:p>
     <w:p>
       <w:pPr>
-        <w:keepNext/>
-        <w:spacing w:before="0" w:after="20" w:line="240" w:lineRule="auto"/>
-        <w:ind w:left="510"/>
+        <w:keepNext w:val="0"/>
+        <w:tabs>
+          <w:tab w:pos="737" w:val="left"/>
+        </w:tabs>
+        <w:spacing w:before="0" w:after="40" w:line="360" w:lineRule="auto"/>
+        <w:ind w:left="737" w:hanging="351"/>
       </w:pPr>
       <w:r>
         <w:rPr>
@@ -930,14 +1170,15 @@
           <w:b w:val="0"/>
           <w:sz w:val="24"/>
         </w:rPr>
-        <w:t>•  Key takeaways, reflection and Q&amp;A</w:t>
+        <w:t>•</w:t>
+        <w:tab/>
+        <w:t>Key takeaways, reflection and Q&amp;A</w:t>
       </w:r>
     </w:p>
     <w:p>
       <w:pPr>
         <w:keepNext/>
-        <w:pageBreakBefore/>
-        <w:spacing w:before="120" w:after="120" w:line="240" w:lineRule="auto"/>
+        <w:spacing w:before="200" w:after="240" w:line="240" w:lineRule="auto"/>
         <w:jc w:val="center"/>
         <w:shd w:val="clear" w:color="auto" w:fill="00708C"/>
       </w:pPr>
@@ -946,16 +1187,19 @@
           <w:rFonts w:ascii="Times New Roman" w:hAnsi="Times New Roman"/>
           <w:b/>
           <w:color w:val="FFFFFF"/>
-          <w:sz w:val="28"/>
+          <w:sz w:val="36"/>
         </w:rPr>
         <w:t>Training Methodology</w:t>
       </w:r>
     </w:p>
     <w:p>
       <w:pPr>
-        <w:keepNext/>
-        <w:spacing w:before="0" w:after="20" w:line="240" w:lineRule="auto"/>
-        <w:ind w:left="510"/>
+        <w:keepNext w:val="0"/>
+        <w:tabs>
+          <w:tab w:pos="737" w:val="left"/>
+        </w:tabs>
+        <w:spacing w:before="0" w:after="40" w:line="360" w:lineRule="auto"/>
+        <w:ind w:left="737" w:hanging="351"/>
       </w:pPr>
       <w:r>
         <w:rPr>
@@ -963,14 +1207,19 @@
           <w:b w:val="0"/>
           <w:sz w:val="24"/>
         </w:rPr>
-        <w:t>•  Interactive lectures and demonstrations</w:t>
+        <w:t>•</w:t>
+        <w:tab/>
+        <w:t>Interactive lectures and demonstrations</w:t>
       </w:r>
     </w:p>
     <w:p>
       <w:pPr>
-        <w:keepNext/>
-        <w:spacing w:before="0" w:after="20" w:line="240" w:lineRule="auto"/>
-        <w:ind w:left="510"/>
+        <w:keepNext w:val="0"/>
+        <w:tabs>
+          <w:tab w:pos="737" w:val="left"/>
+        </w:tabs>
+        <w:spacing w:before="0" w:after="40" w:line="360" w:lineRule="auto"/>
+        <w:ind w:left="737" w:hanging="351"/>
       </w:pPr>
       <w:r>
         <w:rPr>
@@ -978,14 +1227,19 @@
           <w:b w:val="0"/>
           <w:sz w:val="24"/>
         </w:rPr>
-        <w:t>•  Guided hands-on practice with Microsoft Copilot and Gemini Notebook</w:t>
+        <w:t>•</w:t>
+        <w:tab/>
+        <w:t>Guided hands-on practice with Microsoft Copilot and Gemini Notebook</w:t>
       </w:r>
     </w:p>
     <w:p>
       <w:pPr>
-        <w:keepNext/>
-        <w:spacing w:before="0" w:after="20" w:line="240" w:lineRule="auto"/>
-        <w:ind w:left="510"/>
+        <w:keepNext w:val="0"/>
+        <w:tabs>
+          <w:tab w:pos="737" w:val="left"/>
+        </w:tabs>
+        <w:spacing w:before="0" w:after="40" w:line="360" w:lineRule="auto"/>
+        <w:ind w:left="737" w:hanging="351"/>
       </w:pPr>
       <w:r>
         <w:rPr>
@@ -993,14 +1247,19 @@
           <w:b w:val="0"/>
           <w:sz w:val="24"/>
         </w:rPr>
-        <w:t>•  Workplace scenario exercises</w:t>
+        <w:t>•</w:t>
+        <w:tab/>
+        <w:t>Workplace scenario exercises</w:t>
       </w:r>
     </w:p>
     <w:p>
       <w:pPr>
-        <w:keepNext/>
-        <w:spacing w:before="0" w:after="20" w:line="240" w:lineRule="auto"/>
-        <w:ind w:left="510"/>
+        <w:keepNext w:val="0"/>
+        <w:tabs>
+          <w:tab w:pos="737" w:val="left"/>
+        </w:tabs>
+        <w:spacing w:before="0" w:after="40" w:line="360" w:lineRule="auto"/>
+        <w:ind w:left="737" w:hanging="351"/>
       </w:pPr>
       <w:r>
         <w:rPr>
@@ -1008,14 +1267,19 @@
           <w:b w:val="0"/>
           <w:sz w:val="24"/>
         </w:rPr>
-        <w:t>•  Data and dashboard interpretation exercises</w:t>
+        <w:t>•</w:t>
+        <w:tab/>
+        <w:t>Data and dashboard interpretation exercises</w:t>
       </w:r>
     </w:p>
     <w:p>
       <w:pPr>
-        <w:keepNext/>
-        <w:spacing w:before="0" w:after="20" w:line="240" w:lineRule="auto"/>
-        <w:ind w:left="510"/>
+        <w:keepNext w:val="0"/>
+        <w:tabs>
+          <w:tab w:pos="737" w:val="left"/>
+        </w:tabs>
+        <w:spacing w:before="0" w:after="40" w:line="360" w:lineRule="auto"/>
+        <w:ind w:left="737" w:hanging="351"/>
       </w:pPr>
       <w:r>
         <w:rPr>
@@ -1023,14 +1287,19 @@
           <w:b w:val="0"/>
           <w:sz w:val="24"/>
         </w:rPr>
-        <w:t>•  Group discussions and experience sharing</w:t>
+        <w:t>•</w:t>
+        <w:tab/>
+        <w:t>Group discussions and experience sharing</w:t>
       </w:r>
     </w:p>
     <w:p>
       <w:pPr>
-        <w:keepNext/>
-        <w:spacing w:before="0" w:after="20" w:line="240" w:lineRule="auto"/>
-        <w:ind w:left="510"/>
+        <w:keepNext w:val="0"/>
+        <w:tabs>
+          <w:tab w:pos="737" w:val="left"/>
+        </w:tabs>
+        <w:spacing w:before="0" w:after="40" w:line="360" w:lineRule="auto"/>
+        <w:ind w:left="737" w:hanging="351"/>
       </w:pPr>
       <w:r>
         <w:rPr>
@@ -1038,14 +1307,19 @@
           <w:b w:val="0"/>
           <w:sz w:val="24"/>
         </w:rPr>
-        <w:t>•  Case studies</w:t>
+        <w:t>•</w:t>
+        <w:tab/>
+        <w:t>Case studies</w:t>
       </w:r>
     </w:p>
     <w:p>
       <w:pPr>
-        <w:keepNext/>
-        <w:spacing w:before="0" w:after="20" w:line="240" w:lineRule="auto"/>
-        <w:ind w:left="510"/>
+        <w:keepNext w:val="0"/>
+        <w:tabs>
+          <w:tab w:pos="737" w:val="left"/>
+        </w:tabs>
+        <w:spacing w:before="0" w:after="40" w:line="360" w:lineRule="auto"/>
+        <w:ind w:left="737" w:hanging="351"/>
       </w:pPr>
       <w:r>
         <w:rPr>
@@ -1053,13 +1327,15 @@
           <w:b w:val="0"/>
           <w:sz w:val="24"/>
         </w:rPr>
-        <w:t>•  Action planning and facilitator feedback</w:t>
+        <w:t>•</w:t>
+        <w:tab/>
+        <w:t>Action planning and facilitator feedback</w:t>
       </w:r>
     </w:p>
     <w:p>
       <w:pPr>
         <w:keepNext/>
-        <w:spacing w:before="120" w:after="120" w:line="240" w:lineRule="auto"/>
+        <w:spacing w:before="200" w:after="240" w:line="240" w:lineRule="auto"/>
         <w:jc w:val="center"/>
         <w:shd w:val="clear" w:color="auto" w:fill="00708C"/>
       </w:pPr>
@@ -1068,16 +1344,19 @@
           <w:rFonts w:ascii="Times New Roman" w:hAnsi="Times New Roman"/>
           <w:b/>
           <w:color w:val="FFFFFF"/>
-          <w:sz w:val="28"/>
+          <w:sz w:val="36"/>
         </w:rPr>
         <w:t>Assessment Method</w:t>
       </w:r>
     </w:p>
     <w:p>
       <w:pPr>
-        <w:keepNext/>
-        <w:spacing w:before="0" w:after="20" w:line="240" w:lineRule="auto"/>
-        <w:ind w:left="510"/>
+        <w:keepNext w:val="0"/>
+        <w:tabs>
+          <w:tab w:pos="737" w:val="left"/>
+        </w:tabs>
+        <w:spacing w:before="0" w:after="40" w:line="360" w:lineRule="auto"/>
+        <w:ind w:left="737" w:hanging="351"/>
       </w:pPr>
       <w:r>
         <w:rPr>
@@ -1085,14 +1364,19 @@
           <w:b w:val="0"/>
           <w:sz w:val="24"/>
         </w:rPr>
-        <w:t>•  Productivity and data awareness competency check</w:t>
+        <w:t>•</w:t>
+        <w:tab/>
+        <w:t>Productivity and data awareness competency check</w:t>
       </w:r>
     </w:p>
     <w:p>
       <w:pPr>
-        <w:keepNext/>
-        <w:spacing w:before="0" w:after="20" w:line="240" w:lineRule="auto"/>
-        <w:ind w:left="510"/>
+        <w:keepNext w:val="0"/>
+        <w:tabs>
+          <w:tab w:pos="737" w:val="left"/>
+        </w:tabs>
+        <w:spacing w:before="0" w:after="40" w:line="360" w:lineRule="auto"/>
+        <w:ind w:left="737" w:hanging="351"/>
       </w:pPr>
       <w:r>
         <w:rPr>
@@ -1100,14 +1384,19 @@
           <w:b w:val="0"/>
           <w:sz w:val="24"/>
         </w:rPr>
-        <w:t>•  Hands-on exercise observation</w:t>
+        <w:t>•</w:t>
+        <w:tab/>
+        <w:t>Hands-on exercise observation</w:t>
       </w:r>
     </w:p>
     <w:p>
       <w:pPr>
-        <w:keepNext/>
-        <w:spacing w:before="0" w:after="20" w:line="240" w:lineRule="auto"/>
-        <w:ind w:left="510"/>
+        <w:keepNext w:val="0"/>
+        <w:tabs>
+          <w:tab w:pos="737" w:val="left"/>
+        </w:tabs>
+        <w:spacing w:before="0" w:after="40" w:line="360" w:lineRule="auto"/>
+        <w:ind w:left="737" w:hanging="351"/>
       </w:pPr>
       <w:r>
         <w:rPr>
@@ -1115,14 +1404,19 @@
           <w:b w:val="0"/>
           <w:sz w:val="24"/>
         </w:rPr>
-        <w:t>•  KPI definition exercise</w:t>
+        <w:t>•</w:t>
+        <w:tab/>
+        <w:t>KPI definition exercise</w:t>
       </w:r>
     </w:p>
     <w:p>
       <w:pPr>
-        <w:keepNext/>
-        <w:spacing w:before="0" w:after="20" w:line="240" w:lineRule="auto"/>
-        <w:ind w:left="510"/>
+        <w:keepNext w:val="0"/>
+        <w:tabs>
+          <w:tab w:pos="737" w:val="left"/>
+        </w:tabs>
+        <w:spacing w:before="0" w:after="40" w:line="360" w:lineRule="auto"/>
+        <w:ind w:left="737" w:hanging="351"/>
       </w:pPr>
       <w:r>
         <w:rPr>
@@ -1130,14 +1424,19 @@
           <w:b w:val="0"/>
           <w:sz w:val="24"/>
         </w:rPr>
-        <w:t>•  Dashboard interpretation exercise</w:t>
+        <w:t>•</w:t>
+        <w:tab/>
+        <w:t>Dashboard interpretation exercise</w:t>
       </w:r>
     </w:p>
     <w:p>
       <w:pPr>
-        <w:keepNext/>
-        <w:spacing w:before="0" w:after="20" w:line="240" w:lineRule="auto"/>
-        <w:ind w:left="510"/>
+        <w:keepNext w:val="0"/>
+        <w:tabs>
+          <w:tab w:pos="737" w:val="left"/>
+        </w:tabs>
+        <w:spacing w:before="0" w:after="40" w:line="360" w:lineRule="auto"/>
+        <w:ind w:left="737" w:hanging="351"/>
       </w:pPr>
       <w:r>
         <w:rPr>
@@ -1145,14 +1444,19 @@
           <w:b w:val="0"/>
           <w:sz w:val="24"/>
         </w:rPr>
-        <w:t>•  Group presentation and discussion</w:t>
+        <w:t>•</w:t>
+        <w:tab/>
+        <w:t>Group presentation and discussion</w:t>
       </w:r>
     </w:p>
     <w:p>
       <w:pPr>
-        <w:keepNext/>
-        <w:spacing w:before="0" w:after="20" w:line="240" w:lineRule="auto"/>
-        <w:ind w:left="510"/>
+        <w:keepNext w:val="0"/>
+        <w:tabs>
+          <w:tab w:pos="737" w:val="left"/>
+        </w:tabs>
+        <w:spacing w:before="0" w:after="40" w:line="360" w:lineRule="auto"/>
+        <w:ind w:left="737" w:hanging="351"/>
       </w:pPr>
       <w:r>
         <w:rPr>
@@ -1160,14 +1464,19 @@
           <w:b w:val="0"/>
           <w:sz w:val="24"/>
         </w:rPr>
-        <w:t>•  Facilitator feedback</w:t>
+        <w:t>•</w:t>
+        <w:tab/>
+        <w:t>Facilitator feedback</w:t>
       </w:r>
     </w:p>
     <w:p>
       <w:pPr>
-        <w:keepNext/>
-        <w:spacing w:before="0" w:after="20" w:line="240" w:lineRule="auto"/>
-        <w:ind w:left="510"/>
+        <w:keepNext w:val="0"/>
+        <w:tabs>
+          <w:tab w:pos="737" w:val="left"/>
+        </w:tabs>
+        <w:spacing w:before="0" w:after="40" w:line="360" w:lineRule="auto"/>
+        <w:ind w:left="737" w:hanging="351"/>
       </w:pPr>
       <w:r>
         <w:rPr>
@@ -1175,13 +1484,15 @@
           <w:b w:val="0"/>
           <w:sz w:val="24"/>
         </w:rPr>
-        <w:t>•  Workplace Improvement Project</w:t>
+        <w:t>•</w:t>
+        <w:tab/>
+        <w:t>Workplace Improvement Project</w:t>
       </w:r>
     </w:p>
     <w:p>
       <w:pPr>
         <w:keepNext/>
-        <w:spacing w:before="120" w:after="120" w:line="240" w:lineRule="auto"/>
+        <w:spacing w:before="200" w:after="240" w:line="240" w:lineRule="auto"/>
         <w:jc w:val="center"/>
         <w:shd w:val="clear" w:color="auto" w:fill="00708C"/>
       </w:pPr>
@@ -1190,15 +1501,15 @@
           <w:rFonts w:ascii="Times New Roman" w:hAnsi="Times New Roman"/>
           <w:b/>
           <w:color w:val="FFFFFF"/>
-          <w:sz w:val="28"/>
+          <w:sz w:val="36"/>
         </w:rPr>
         <w:t>Workplace Improvement Project</w:t>
       </w:r>
     </w:p>
     <w:p>
       <w:pPr>
-        <w:keepNext/>
-        <w:spacing w:before="0" w:after="120" w:line="240" w:lineRule="auto"/>
+        <w:keepNext w:val="0"/>
+        <w:spacing w:before="0" w:after="140" w:line="360" w:lineRule="auto"/>
         <w:jc w:val="both"/>
       </w:pPr>
       <w:r>
@@ -1212,9 +1523,12 @@
     </w:p>
     <w:p>
       <w:pPr>
-        <w:keepNext/>
-        <w:spacing w:before="0" w:after="20" w:line="240" w:lineRule="auto"/>
-        <w:ind w:left="510"/>
+        <w:keepNext w:val="0"/>
+        <w:tabs>
+          <w:tab w:pos="737" w:val="left"/>
+        </w:tabs>
+        <w:spacing w:before="0" w:after="40" w:line="360" w:lineRule="auto"/>
+        <w:ind w:left="737" w:hanging="351"/>
       </w:pPr>
       <w:r>
         <w:rPr>
@@ -1222,14 +1536,19 @@
           <w:b w:val="0"/>
           <w:sz w:val="24"/>
         </w:rPr>
-        <w:t>•  Define the process and the issue</w:t>
+        <w:t>•</w:t>
+        <w:tab/>
+        <w:t>Define the process and the issue</w:t>
       </w:r>
     </w:p>
     <w:p>
       <w:pPr>
-        <w:keepNext/>
-        <w:spacing w:before="0" w:after="20" w:line="240" w:lineRule="auto"/>
-        <w:ind w:left="510"/>
+        <w:keepNext w:val="0"/>
+        <w:tabs>
+          <w:tab w:pos="737" w:val="left"/>
+        </w:tabs>
+        <w:spacing w:before="0" w:after="40" w:line="360" w:lineRule="auto"/>
+        <w:ind w:left="737" w:hanging="351"/>
       </w:pPr>
       <w:r>
         <w:rPr>
@@ -1237,14 +1556,19 @@
           <w:b w:val="0"/>
           <w:sz w:val="24"/>
         </w:rPr>
-        <w:t>•  Identify suitable KPIs and data sources</w:t>
+        <w:t>•</w:t>
+        <w:tab/>
+        <w:t>Identify suitable KPIs and data sources</w:t>
       </w:r>
     </w:p>
     <w:p>
       <w:pPr>
-        <w:keepNext/>
-        <w:spacing w:before="0" w:after="20" w:line="240" w:lineRule="auto"/>
-        <w:ind w:left="510"/>
+        <w:keepNext w:val="0"/>
+        <w:tabs>
+          <w:tab w:pos="737" w:val="left"/>
+        </w:tabs>
+        <w:spacing w:before="0" w:after="40" w:line="360" w:lineRule="auto"/>
+        <w:ind w:left="737" w:hanging="351"/>
       </w:pPr>
       <w:r>
         <w:rPr>
@@ -1252,14 +1576,19 @@
           <w:b w:val="0"/>
           <w:sz w:val="24"/>
         </w:rPr>
-        <w:t>•  Apply Microsoft Copilot and Gemini Notebook to improve the workflow</w:t>
+        <w:t>•</w:t>
+        <w:tab/>
+        <w:t>Apply Microsoft Copilot and Gemini Notebook to improve the workflow</w:t>
       </w:r>
     </w:p>
     <w:p>
       <w:pPr>
-        <w:keepNext/>
-        <w:spacing w:before="0" w:after="20" w:line="240" w:lineRule="auto"/>
-        <w:ind w:left="510"/>
+        <w:keepNext w:val="0"/>
+        <w:tabs>
+          <w:tab w:pos="737" w:val="left"/>
+        </w:tabs>
+        <w:spacing w:before="0" w:after="40" w:line="360" w:lineRule="auto"/>
+        <w:ind w:left="737" w:hanging="351"/>
       </w:pPr>
       <w:r>
         <w:rPr>
@@ -1267,14 +1596,19 @@
           <w:b w:val="0"/>
           <w:sz w:val="24"/>
         </w:rPr>
-        <w:t>•  Develop an improved monitoring and reporting approach</w:t>
+        <w:t>•</w:t>
+        <w:tab/>
+        <w:t>Develop an improved monitoring and reporting approach</w:t>
       </w:r>
     </w:p>
     <w:p>
       <w:pPr>
-        <w:keepNext/>
-        <w:spacing w:before="0" w:after="20" w:line="240" w:lineRule="auto"/>
-        <w:ind w:left="510"/>
+        <w:keepNext w:val="0"/>
+        <w:tabs>
+          <w:tab w:pos="737" w:val="left"/>
+        </w:tabs>
+        <w:spacing w:before="0" w:after="40" w:line="360" w:lineRule="auto"/>
+        <w:ind w:left="737" w:hanging="351"/>
       </w:pPr>
       <w:r>
         <w:rPr>
@@ -1282,13 +1616,15 @@
           <w:b w:val="0"/>
           <w:sz w:val="24"/>
         </w:rPr>
-        <w:t>•  Establish an action plan</w:t>
+        <w:t>•</w:t>
+        <w:tab/>
+        <w:t>Establish an action plan</w:t>
       </w:r>
     </w:p>
     <w:p>
       <w:pPr>
         <w:keepNext/>
-        <w:spacing w:before="0" w:after="40" w:line="240" w:lineRule="auto"/>
+        <w:spacing w:before="0" w:after="40" w:line="360" w:lineRule="auto"/>
       </w:pPr>
       <w:r>
         <w:rPr>
@@ -1301,9 +1637,8 @@
     </w:p>
     <w:p>
       <w:pPr>
-        <w:keepNext/>
-        <w:spacing w:before="0" w:after="120" w:line="240" w:lineRule="auto"/>
-        <w:ind w:left="510"/>
+        <w:keepNext w:val="0"/>
+        <w:spacing w:before="0" w:after="120" w:line="360" w:lineRule="auto"/>
       </w:pPr>
       <w:r>
         <w:rPr>
@@ -1317,7 +1652,7 @@
     <w:p>
       <w:pPr>
         <w:keepNext/>
-        <w:spacing w:before="120" w:after="120" w:line="240" w:lineRule="auto"/>
+        <w:spacing w:before="200" w:after="240" w:line="240" w:lineRule="auto"/>
         <w:jc w:val="center"/>
         <w:shd w:val="clear" w:color="auto" w:fill="00708C"/>
       </w:pPr>
@@ -1326,16 +1661,19 @@
           <w:rFonts w:ascii="Times New Roman" w:hAnsi="Times New Roman"/>
           <w:b/>
           <w:color w:val="FFFFFF"/>
-          <w:sz w:val="28"/>
+          <w:sz w:val="36"/>
         </w:rPr>
         <w:t>Targeted Participants</w:t>
       </w:r>
     </w:p>
     <w:p>
       <w:pPr>
-        <w:keepNext/>
-        <w:spacing w:before="0" w:after="20" w:line="240" w:lineRule="auto"/>
-        <w:ind w:left="510"/>
+        <w:keepNext w:val="0"/>
+        <w:tabs>
+          <w:tab w:pos="737" w:val="left"/>
+        </w:tabs>
+        <w:spacing w:before="0" w:after="40" w:line="360" w:lineRule="auto"/>
+        <w:ind w:left="737" w:hanging="351"/>
       </w:pPr>
       <w:r>
         <w:rPr>
@@ -1343,14 +1681,19 @@
           <w:b w:val="0"/>
           <w:sz w:val="24"/>
         </w:rPr>
-        <w:t>•  Executives, Supervisors and Team Leaders</w:t>
+        <w:t>•</w:t>
+        <w:tab/>
+        <w:t>Executives, Supervisors and Team Leaders</w:t>
       </w:r>
     </w:p>
     <w:p>
       <w:pPr>
-        <w:keepNext/>
-        <w:spacing w:before="0" w:after="20" w:line="240" w:lineRule="auto"/>
-        <w:ind w:left="510"/>
+        <w:keepNext w:val="0"/>
+        <w:tabs>
+          <w:tab w:pos="737" w:val="left"/>
+        </w:tabs>
+        <w:spacing w:before="0" w:after="40" w:line="360" w:lineRule="auto"/>
+        <w:ind w:left="737" w:hanging="351"/>
       </w:pPr>
       <w:r>
         <w:rPr>
@@ -1358,14 +1701,19 @@
           <w:b w:val="0"/>
           <w:sz w:val="24"/>
         </w:rPr>
-        <w:t>•  Administrative and operations personnel</w:t>
+        <w:t>•</w:t>
+        <w:tab/>
+        <w:t>Administrative and operations personnel</w:t>
       </w:r>
     </w:p>
     <w:p>
       <w:pPr>
-        <w:keepNext/>
-        <w:spacing w:before="0" w:after="20" w:line="240" w:lineRule="auto"/>
-        <w:ind w:left="510"/>
+        <w:keepNext w:val="0"/>
+        <w:tabs>
+          <w:tab w:pos="737" w:val="left"/>
+        </w:tabs>
+        <w:spacing w:before="0" w:after="40" w:line="360" w:lineRule="auto"/>
+        <w:ind w:left="737" w:hanging="351"/>
       </w:pPr>
       <w:r>
         <w:rPr>
@@ -1373,14 +1721,19 @@
           <w:b w:val="0"/>
           <w:sz w:val="24"/>
         </w:rPr>
-        <w:t>•  Personnel responsible for reporting, monitoring or coordinating work</w:t>
+        <w:t>•</w:t>
+        <w:tab/>
+        <w:t>Personnel responsible for reporting, monitoring or coordinating work</w:t>
       </w:r>
     </w:p>
     <w:p>
       <w:pPr>
-        <w:keepNext/>
-        <w:spacing w:before="0" w:after="20" w:line="240" w:lineRule="auto"/>
-        <w:ind w:left="510"/>
+        <w:keepNext w:val="0"/>
+        <w:tabs>
+          <w:tab w:pos="737" w:val="left"/>
+        </w:tabs>
+        <w:spacing w:before="0" w:after="40" w:line="360" w:lineRule="auto"/>
+        <w:ind w:left="737" w:hanging="351"/>
       </w:pPr>
       <w:r>
         <w:rPr>
@@ -1388,13 +1741,15 @@
           <w:b w:val="0"/>
           <w:sz w:val="24"/>
         </w:rPr>
-        <w:t>•  Staff who prepare or interpret operational data</w:t>
+        <w:t>•</w:t>
+        <w:tab/>
+        <w:t>Staff who prepare or interpret operational data</w:t>
       </w:r>
     </w:p>
     <w:p>
       <w:pPr>
         <w:keepNext/>
-        <w:spacing w:before="120" w:after="120" w:line="240" w:lineRule="auto"/>
+        <w:spacing w:before="200" w:after="240" w:line="240" w:lineRule="auto"/>
         <w:jc w:val="center"/>
         <w:shd w:val="clear" w:color="auto" w:fill="00708C"/>
       </w:pPr>
@@ -1403,15 +1758,15 @@
           <w:rFonts w:ascii="Times New Roman" w:hAnsi="Times New Roman"/>
           <w:b/>
           <w:color w:val="FFFFFF"/>
-          <w:sz w:val="28"/>
+          <w:sz w:val="36"/>
         </w:rPr>
         <w:t>Trainer’s Profile</w:t>
       </w:r>
     </w:p>
     <w:p>
       <w:pPr>
-        <w:keepNext/>
-        <w:spacing w:before="0" w:after="160" w:line="240" w:lineRule="auto"/>
+        <w:keepNext w:val="0"/>
+        <w:spacing w:before="0" w:after="140" w:line="360" w:lineRule="auto"/>
         <w:jc w:val="both"/>
       </w:pPr>
       <w:r>
@@ -1426,7 +1781,7 @@
     <w:p>
       <w:pPr>
         <w:keepNext/>
-        <w:spacing w:before="120" w:after="120" w:line="240" w:lineRule="auto"/>
+        <w:spacing w:before="200" w:after="240" w:line="240" w:lineRule="auto"/>
         <w:jc w:val="center"/>
         <w:shd w:val="clear" w:color="auto" w:fill="00708C"/>
       </w:pPr>
@@ -1435,15 +1790,15 @@
           <w:rFonts w:ascii="Times New Roman" w:hAnsi="Times New Roman"/>
           <w:b/>
           <w:color w:val="FFFFFF"/>
-          <w:sz w:val="28"/>
+          <w:sz w:val="36"/>
         </w:rPr>
         <w:t>Course Material</w:t>
       </w:r>
     </w:p>
     <w:p>
       <w:pPr>
-        <w:keepNext/>
-        <w:spacing w:before="0" w:after="160" w:line="240" w:lineRule="auto"/>
+        <w:keepNext w:val="0"/>
+        <w:spacing w:before="0" w:after="140" w:line="360" w:lineRule="auto"/>
         <w:jc w:val="both"/>
       </w:pPr>
       <w:r>
@@ -1458,7 +1813,7 @@
     <w:p>
       <w:pPr>
         <w:keepNext/>
-        <w:spacing w:before="120" w:after="120" w:line="240" w:lineRule="auto"/>
+        <w:spacing w:before="200" w:after="240" w:line="240" w:lineRule="auto"/>
         <w:jc w:val="center"/>
         <w:shd w:val="clear" w:color="auto" w:fill="00708C"/>
       </w:pPr>
@@ -1467,15 +1822,15 @@
           <w:rFonts w:ascii="Times New Roman" w:hAnsi="Times New Roman"/>
           <w:b/>
           <w:color w:val="FFFFFF"/>
-          <w:sz w:val="28"/>
+          <w:sz w:val="36"/>
         </w:rPr>
         <w:t>Duration</w:t>
       </w:r>
     </w:p>
     <w:p>
       <w:pPr>
-        <w:keepNext/>
-        <w:spacing w:before="0" w:after="160" w:line="240" w:lineRule="auto"/>
+        <w:keepNext w:val="0"/>
+        <w:spacing w:before="0" w:after="140" w:line="360" w:lineRule="auto"/>
         <w:jc w:val="both"/>
       </w:pPr>
       <w:r>
@@ -1484,13 +1839,13 @@
           <w:b w:val="0"/>
           <w:sz w:val="24"/>
         </w:rPr>
-        <w:t>1-day (7 training hours)</w:t>
+        <w:t>1-day (7 training hours, excluding lunch break)</w:t>
       </w:r>
     </w:p>
     <w:p>
       <w:pPr>
         <w:keepNext/>
-        <w:spacing w:before="120" w:after="120" w:line="240" w:lineRule="auto"/>
+        <w:spacing w:before="200" w:after="240" w:line="240" w:lineRule="auto"/>
         <w:jc w:val="center"/>
         <w:shd w:val="clear" w:color="auto" w:fill="00708C"/>
       </w:pPr>
@@ -1499,15 +1854,15 @@
           <w:rFonts w:ascii="Times New Roman" w:hAnsi="Times New Roman"/>
           <w:b/>
           <w:color w:val="FFFFFF"/>
-          <w:sz w:val="28"/>
+          <w:sz w:val="36"/>
         </w:rPr>
         <w:t>Medium of Instruction</w:t>
       </w:r>
     </w:p>
     <w:p>
       <w:pPr>
-        <w:keepNext/>
-        <w:spacing w:before="0" w:after="160" w:line="240" w:lineRule="auto"/>
+        <w:keepNext w:val="0"/>
+        <w:spacing w:before="0" w:after="140" w:line="360" w:lineRule="auto"/>
         <w:jc w:val="both"/>
       </w:pPr>
       <w:r>
@@ -1520,8 +1875,8 @@
       </w:r>
     </w:p>
     <w:sectPr>
-      <w:pgSz w:w="11906" w:h="16838"/>
-      <w:pgMar w:top="1304" w:right="1361" w:bottom="1304" w:left="1757" w:header="720" w:footer="720" w:gutter="0"/>
+      <w:pgSz w:w="12240" w:h="15840"/>
+      <w:pgMar w:top="1152" w:right="1267" w:bottom="1224" w:left="1800" w:header="720" w:footer="720" w:gutter="0"/>
       <w:cols w:space="720"/>
       <w:docGrid w:linePitch="360"/>
     </w:sectPr>

</xml_diff>